<commit_message>
Add personal-site project; update resume
Added Personal Portfolio as a project card (GitHub link). Updated resume
to include the same project with tech stack and bullet points.
</commit_message>
<xml_diff>
--- a/public/resume.docx
+++ b/public/resume.docx
@@ -46,7 +46,7 @@
         </w:rPr>
         <w:t xml:space="preserve">   •   </w:t>
       </w:r>
-      <w:hyperlink w:history="1" r:id="rIdirgle_o3mzcs8-_y3o8bs">
+      <w:hyperlink w:history="1" r:id="rIddkeflmta7scjwmf9vyd3l">
         <w:r>
           <w:rPr>
             <w:rFonts w:ascii="Calibri" w:cs="Calibri" w:eastAsia="Calibri" w:hAnsi="Calibri"/>
@@ -67,7 +67,7 @@
         </w:rPr>
         <w:t xml:space="preserve">   •   </w:t>
       </w:r>
-      <w:hyperlink w:history="1" r:id="rIdb3nuuo5zkxe5spknbpq-i">
+      <w:hyperlink w:history="1" r:id="rIdts7rolrb8vwphrwgyyfkv">
         <w:r>
           <w:rPr>
             <w:rFonts w:ascii="Calibri" w:cs="Calibri" w:eastAsia="Calibri" w:hAnsi="Calibri"/>
@@ -88,7 +88,7 @@
         </w:rPr>
         <w:t xml:space="preserve">   •   </w:t>
       </w:r>
-      <w:hyperlink w:history="1" r:id="rIdnv03yubbnojewyxkqumya">
+      <w:hyperlink w:history="1" r:id="rIdoupkpwbhxqkqo2nhxlvlv">
         <w:r>
           <w:rPr>
             <w:rFonts w:ascii="Calibri" w:cs="Calibri" w:eastAsia="Calibri" w:hAnsi="Calibri"/>
@@ -505,7 +505,7 @@
         </w:rPr>
         <w:t xml:space="preserve">Astro, Tailwind CSS, JavaScript, Netlify  •  </w:t>
       </w:r>
-      <w:hyperlink w:history="1" r:id="rIdzshqjlheprrygg7u_r_zm">
+      <w:hyperlink w:history="1" r:id="rIdbxjtvy6datgksen3w5pj1">
         <w:r>
           <w:rPr>
             <w:rFonts w:ascii="Calibri" w:cs="Calibri" w:eastAsia="Calibri" w:hAnsi="Calibri"/>
@@ -604,7 +604,7 @@
         </w:rPr>
         <w:t xml:space="preserve">Python, Pandas, NumPy, scikit-learn, matplotlib, seaborn  •  </w:t>
       </w:r>
-      <w:hyperlink w:history="1" r:id="rIdo9uzrt5cxlkomndyk_gig">
+      <w:hyperlink w:history="1" r:id="rIdz1irhpv3s_opbrmjlg41b">
         <w:r>
           <w:rPr>
             <w:rFonts w:ascii="Calibri" w:cs="Calibri" w:eastAsia="Calibri" w:hAnsi="Calibri"/>
@@ -687,7 +687,7 @@
           <w:sz w:val="23"/>
           <w:szCs w:val="23"/>
         </w:rPr>
-        <w:t xml:space="preserve">Schedule Creator</w:t>
+        <w:t xml:space="preserve">Personal Portfolio Website</w:t>
       </w:r>
     </w:p>
     <w:p>
@@ -701,9 +701,108 @@
           <w:sz w:val="22"/>
           <w:szCs w:val="22"/>
         </w:rPr>
+        <w:t xml:space="preserve">Next.js 15, TypeScript, Tailwind CSS v4, Framer Motion  •  </w:t>
+      </w:r>
+      <w:hyperlink w:history="1" r:id="rIdchvqcrcpk94q-izcoux_d">
+        <w:r>
+          <w:rPr>
+            <w:rFonts w:ascii="Calibri" w:cs="Calibri" w:eastAsia="Calibri" w:hAnsi="Calibri"/>
+            <w:color w:val="6B7280"/>
+            <w:sz w:val="22"/>
+            <w:szCs w:val="22"/>
+            <w:u w:val="single"/>
+          </w:rPr>
+          <w:t xml:space="preserve">github.com/tonyx1998/personal-site</w:t>
+        </w:r>
+      </w:hyperlink>
+    </w:p>
+    <w:p>
+      <w:pPr>
+        <w:pStyle w:val="ListParagraph"/>
+        <w:numPr>
+          <w:ilvl w:val="0"/>
+          <w:numId w:val="2"/>
+        </w:numPr>
+        <w:spacing w:after="0" w:before="20" w:line="260" w:lineRule="auto"/>
+      </w:pPr>
+      <w:r>
+        <w:rPr>
+          <w:rFonts w:ascii="Calibri" w:cs="Calibri" w:eastAsia="Calibri" w:hAnsi="Calibri"/>
+          <w:color w:val="1A1A1A"/>
+          <w:sz w:val="23"/>
+          <w:szCs w:val="23"/>
+        </w:rPr>
+        <w:t xml:space="preserve">Built a modern full-stack portfolio with dark/light mode, scroll animations, and responsive design</w:t>
+      </w:r>
+    </w:p>
+    <w:p>
+      <w:pPr>
+        <w:pStyle w:val="ListParagraph"/>
+        <w:numPr>
+          <w:ilvl w:val="0"/>
+          <w:numId w:val="2"/>
+        </w:numPr>
+        <w:spacing w:after="0" w:before="0" w:line="260" w:lineRule="auto"/>
+      </w:pPr>
+      <w:r>
+        <w:rPr>
+          <w:rFonts w:ascii="Calibri" w:cs="Calibri" w:eastAsia="Calibri" w:hAnsi="Calibri"/>
+          <w:color w:val="1A1A1A"/>
+          <w:sz w:val="23"/>
+          <w:szCs w:val="23"/>
+        </w:rPr>
+        <w:t xml:space="preserve">Implemented class-based theming with Tailwind CSS v4 custom variants and next-themes</w:t>
+      </w:r>
+    </w:p>
+    <w:p>
+      <w:pPr>
+        <w:pStyle w:val="ListParagraph"/>
+        <w:numPr>
+          <w:ilvl w:val="0"/>
+          <w:numId w:val="2"/>
+        </w:numPr>
+        <w:spacing w:after="0" w:before="0" w:line="260" w:lineRule="auto"/>
+      </w:pPr>
+      <w:r>
+        <w:rPr>
+          <w:rFonts w:ascii="Calibri" w:cs="Calibri" w:eastAsia="Calibri" w:hAnsi="Calibri"/>
+          <w:color w:val="1A1A1A"/>
+          <w:sz w:val="23"/>
+          <w:szCs w:val="23"/>
+        </w:rPr>
+        <w:t xml:space="preserve">Designed and generated a matching professional resume using the docx npm package</w:t>
+      </w:r>
+    </w:p>
+    <w:p>
+      <w:pPr>
+        <w:spacing w:after="0" w:before="120"/>
+      </w:pPr>
+      <w:r>
+        <w:rPr>
+          <w:rFonts w:ascii="Calibri" w:cs="Calibri" w:eastAsia="Calibri" w:hAnsi="Calibri"/>
+          <w:b/>
+          <w:bCs/>
+          <w:color w:val="1A1A1A"/>
+          <w:sz w:val="23"/>
+          <w:szCs w:val="23"/>
+        </w:rPr>
+        <w:t xml:space="preserve">Schedule Creator</w:t>
+      </w:r>
+    </w:p>
+    <w:p>
+      <w:pPr>
+        <w:spacing w:after="16" w:before="4"/>
+      </w:pPr>
+      <w:r>
+        <w:rPr>
+          <w:rFonts w:ascii="Calibri" w:cs="Calibri" w:eastAsia="Calibri" w:hAnsi="Calibri"/>
+          <w:color w:val="6B7280"/>
+          <w:sz w:val="22"/>
+          <w:szCs w:val="22"/>
+        </w:rPr>
         <w:t xml:space="preserve">Java  •  </w:t>
       </w:r>
-      <w:hyperlink w:history="1" r:id="rIdv20ggnqaoefpug4rxeczc">
+      <w:hyperlink w:history="1" r:id="rIdx22zorq76ewaqc01v6a1t">
         <w:r>
           <w:rPr>
             <w:rFonts w:ascii="Calibri" w:cs="Calibri" w:eastAsia="Calibri" w:hAnsi="Calibri"/>

</xml_diff>

<commit_message>
Add live Vercel URL to portfolio project and resume
</commit_message>
<xml_diff>
--- a/public/resume.docx
+++ b/public/resume.docx
@@ -46,7 +46,7 @@
         </w:rPr>
         <w:t xml:space="preserve">   •   </w:t>
       </w:r>
-      <w:hyperlink w:history="1" r:id="rIddkeflmta7scjwmf9vyd3l">
+      <w:hyperlink w:history="1" r:id="rIdrfwmebjixue32bttwjzgt">
         <w:r>
           <w:rPr>
             <w:rFonts w:ascii="Calibri" w:cs="Calibri" w:eastAsia="Calibri" w:hAnsi="Calibri"/>
@@ -67,7 +67,7 @@
         </w:rPr>
         <w:t xml:space="preserve">   •   </w:t>
       </w:r>
-      <w:hyperlink w:history="1" r:id="rIdts7rolrb8vwphrwgyyfkv">
+      <w:hyperlink w:history="1" r:id="rIdi9c6seywcp0n_0x5kb4-9">
         <w:r>
           <w:rPr>
             <w:rFonts w:ascii="Calibri" w:cs="Calibri" w:eastAsia="Calibri" w:hAnsi="Calibri"/>
@@ -88,7 +88,7 @@
         </w:rPr>
         <w:t xml:space="preserve">   •   </w:t>
       </w:r>
-      <w:hyperlink w:history="1" r:id="rIdoupkpwbhxqkqo2nhxlvlv">
+      <w:hyperlink w:history="1" r:id="rIdkpmzv4os2g5g1n9cap8xk">
         <w:r>
           <w:rPr>
             <w:rFonts w:ascii="Calibri" w:cs="Calibri" w:eastAsia="Calibri" w:hAnsi="Calibri"/>
@@ -505,7 +505,7 @@
         </w:rPr>
         <w:t xml:space="preserve">Astro, Tailwind CSS, JavaScript, Netlify  •  </w:t>
       </w:r>
-      <w:hyperlink w:history="1" r:id="rIdbxjtvy6datgksen3w5pj1">
+      <w:hyperlink w:history="1" r:id="rIdnfpbzagh-qiygzttm-ns4">
         <w:r>
           <w:rPr>
             <w:rFonts w:ascii="Calibri" w:cs="Calibri" w:eastAsia="Calibri" w:hAnsi="Calibri"/>
@@ -604,7 +604,7 @@
         </w:rPr>
         <w:t xml:space="preserve">Python, Pandas, NumPy, scikit-learn, matplotlib, seaborn  •  </w:t>
       </w:r>
-      <w:hyperlink w:history="1" r:id="rIdz1irhpv3s_opbrmjlg41b">
+      <w:hyperlink w:history="1" r:id="rIdqmuucoriawx7s7dk0r5kl">
         <w:r>
           <w:rPr>
             <w:rFonts w:ascii="Calibri" w:cs="Calibri" w:eastAsia="Calibri" w:hAnsi="Calibri"/>
@@ -703,7 +703,7 @@
         </w:rPr>
         <w:t xml:space="preserve">Next.js 15, TypeScript, Tailwind CSS v4, Framer Motion  •  </w:t>
       </w:r>
-      <w:hyperlink w:history="1" r:id="rIdchvqcrcpk94q-izcoux_d">
+      <w:hyperlink w:history="1" r:id="rIde3tw5z8-20xew9ixcngs6">
         <w:r>
           <w:rPr>
             <w:rFonts w:ascii="Calibri" w:cs="Calibri" w:eastAsia="Calibri" w:hAnsi="Calibri"/>
@@ -715,84 +715,6 @@
           <w:t xml:space="preserve">github.com/tonyx1998/personal-site</w:t>
         </w:r>
       </w:hyperlink>
-    </w:p>
-    <w:p>
-      <w:pPr>
-        <w:pStyle w:val="ListParagraph"/>
-        <w:numPr>
-          <w:ilvl w:val="0"/>
-          <w:numId w:val="2"/>
-        </w:numPr>
-        <w:spacing w:after="0" w:before="20" w:line="260" w:lineRule="auto"/>
-      </w:pPr>
-      <w:r>
-        <w:rPr>
-          <w:rFonts w:ascii="Calibri" w:cs="Calibri" w:eastAsia="Calibri" w:hAnsi="Calibri"/>
-          <w:color w:val="1A1A1A"/>
-          <w:sz w:val="23"/>
-          <w:szCs w:val="23"/>
-        </w:rPr>
-        <w:t xml:space="preserve">Built a modern full-stack portfolio with dark/light mode, scroll animations, and responsive design</w:t>
-      </w:r>
-    </w:p>
-    <w:p>
-      <w:pPr>
-        <w:pStyle w:val="ListParagraph"/>
-        <w:numPr>
-          <w:ilvl w:val="0"/>
-          <w:numId w:val="2"/>
-        </w:numPr>
-        <w:spacing w:after="0" w:before="0" w:line="260" w:lineRule="auto"/>
-      </w:pPr>
-      <w:r>
-        <w:rPr>
-          <w:rFonts w:ascii="Calibri" w:cs="Calibri" w:eastAsia="Calibri" w:hAnsi="Calibri"/>
-          <w:color w:val="1A1A1A"/>
-          <w:sz w:val="23"/>
-          <w:szCs w:val="23"/>
-        </w:rPr>
-        <w:t xml:space="preserve">Implemented class-based theming with Tailwind CSS v4 custom variants and next-themes</w:t>
-      </w:r>
-    </w:p>
-    <w:p>
-      <w:pPr>
-        <w:pStyle w:val="ListParagraph"/>
-        <w:numPr>
-          <w:ilvl w:val="0"/>
-          <w:numId w:val="2"/>
-        </w:numPr>
-        <w:spacing w:after="0" w:before="0" w:line="260" w:lineRule="auto"/>
-      </w:pPr>
-      <w:r>
-        <w:rPr>
-          <w:rFonts w:ascii="Calibri" w:cs="Calibri" w:eastAsia="Calibri" w:hAnsi="Calibri"/>
-          <w:color w:val="1A1A1A"/>
-          <w:sz w:val="23"/>
-          <w:szCs w:val="23"/>
-        </w:rPr>
-        <w:t xml:space="preserve">Designed and generated a matching professional resume using the docx npm package</w:t>
-      </w:r>
-    </w:p>
-    <w:p>
-      <w:pPr>
-        <w:spacing w:after="0" w:before="120"/>
-      </w:pPr>
-      <w:r>
-        <w:rPr>
-          <w:rFonts w:ascii="Calibri" w:cs="Calibri" w:eastAsia="Calibri" w:hAnsi="Calibri"/>
-          <w:b/>
-          <w:bCs/>
-          <w:color w:val="1A1A1A"/>
-          <w:sz w:val="23"/>
-          <w:szCs w:val="23"/>
-        </w:rPr>
-        <w:t xml:space="preserve">Schedule Creator</w:t>
-      </w:r>
-    </w:p>
-    <w:p>
-      <w:pPr>
-        <w:spacing w:after="16" w:before="4"/>
-      </w:pPr>
       <w:r>
         <w:rPr>
           <w:rFonts w:ascii="Calibri" w:cs="Calibri" w:eastAsia="Calibri" w:hAnsi="Calibri"/>
@@ -800,9 +722,108 @@
           <w:sz w:val="22"/>
           <w:szCs w:val="22"/>
         </w:rPr>
+        <w:t xml:space="preserve">  •  </w:t>
+      </w:r>
+      <w:hyperlink w:history="1" r:id="rIdhbrcsppjql4dxstthzqvq">
+        <w:r>
+          <w:rPr>
+            <w:rFonts w:ascii="Calibri" w:cs="Calibri" w:eastAsia="Calibri" w:hAnsi="Calibri"/>
+            <w:color w:val="6B7280"/>
+            <w:sz w:val="22"/>
+            <w:szCs w:val="22"/>
+            <w:u w:val="single"/>
+          </w:rPr>
+          <w:t xml:space="preserve">personal-site-liart-beta.vercel.app</w:t>
+        </w:r>
+      </w:hyperlink>
+    </w:p>
+    <w:p>
+      <w:pPr>
+        <w:pStyle w:val="ListParagraph"/>
+        <w:numPr>
+          <w:ilvl w:val="0"/>
+          <w:numId w:val="2"/>
+        </w:numPr>
+        <w:spacing w:after="0" w:before="20" w:line="260" w:lineRule="auto"/>
+      </w:pPr>
+      <w:r>
+        <w:rPr>
+          <w:rFonts w:ascii="Calibri" w:cs="Calibri" w:eastAsia="Calibri" w:hAnsi="Calibri"/>
+          <w:color w:val="1A1A1A"/>
+          <w:sz w:val="23"/>
+          <w:szCs w:val="23"/>
+        </w:rPr>
+        <w:t xml:space="preserve">Built a modern full-stack portfolio with dark/light mode, scroll animations, and responsive design</w:t>
+      </w:r>
+    </w:p>
+    <w:p>
+      <w:pPr>
+        <w:pStyle w:val="ListParagraph"/>
+        <w:numPr>
+          <w:ilvl w:val="0"/>
+          <w:numId w:val="2"/>
+        </w:numPr>
+        <w:spacing w:after="0" w:before="0" w:line="260" w:lineRule="auto"/>
+      </w:pPr>
+      <w:r>
+        <w:rPr>
+          <w:rFonts w:ascii="Calibri" w:cs="Calibri" w:eastAsia="Calibri" w:hAnsi="Calibri"/>
+          <w:color w:val="1A1A1A"/>
+          <w:sz w:val="23"/>
+          <w:szCs w:val="23"/>
+        </w:rPr>
+        <w:t xml:space="preserve">Implemented class-based theming with Tailwind CSS v4 custom variants and next-themes</w:t>
+      </w:r>
+    </w:p>
+    <w:p>
+      <w:pPr>
+        <w:pStyle w:val="ListParagraph"/>
+        <w:numPr>
+          <w:ilvl w:val="0"/>
+          <w:numId w:val="2"/>
+        </w:numPr>
+        <w:spacing w:after="0" w:before="0" w:line="260" w:lineRule="auto"/>
+      </w:pPr>
+      <w:r>
+        <w:rPr>
+          <w:rFonts w:ascii="Calibri" w:cs="Calibri" w:eastAsia="Calibri" w:hAnsi="Calibri"/>
+          <w:color w:val="1A1A1A"/>
+          <w:sz w:val="23"/>
+          <w:szCs w:val="23"/>
+        </w:rPr>
+        <w:t xml:space="preserve">Designed and generated a matching professional resume using the docx npm package</w:t>
+      </w:r>
+    </w:p>
+    <w:p>
+      <w:pPr>
+        <w:spacing w:after="0" w:before="120"/>
+      </w:pPr>
+      <w:r>
+        <w:rPr>
+          <w:rFonts w:ascii="Calibri" w:cs="Calibri" w:eastAsia="Calibri" w:hAnsi="Calibri"/>
+          <w:b/>
+          <w:bCs/>
+          <w:color w:val="1A1A1A"/>
+          <w:sz w:val="23"/>
+          <w:szCs w:val="23"/>
+        </w:rPr>
+        <w:t xml:space="preserve">Schedule Creator</w:t>
+      </w:r>
+    </w:p>
+    <w:p>
+      <w:pPr>
+        <w:spacing w:after="16" w:before="4"/>
+      </w:pPr>
+      <w:r>
+        <w:rPr>
+          <w:rFonts w:ascii="Calibri" w:cs="Calibri" w:eastAsia="Calibri" w:hAnsi="Calibri"/>
+          <w:color w:val="6B7280"/>
+          <w:sz w:val="22"/>
+          <w:szCs w:val="22"/>
+        </w:rPr>
         <w:t xml:space="preserve">Java  •  </w:t>
       </w:r>
-      <w:hyperlink w:history="1" r:id="rIdx22zorq76ewaqc01v6a1t">
+      <w:hyperlink w:history="1" r:id="rIdzniunlejf1cet4nnrfv49">
         <w:r>
           <w:rPr>
             <w:rFonts w:ascii="Calibri" w:cs="Calibri" w:eastAsia="Calibri" w:hAnsi="Calibri"/>

</xml_diff>